<commit_message>
Deploy preview for PR 635 🛫
</commit_message>
<xml_diff>
--- a/pr-preview/pr-635/vignettes/articles/version-crosswalk-1.3-to-1.4.docx
+++ b/pr-preview/pr-635/vignettes/articles/version-crosswalk-1.3-to-1.4.docx
@@ -3067,7 +3067,7 @@
         <w:rPr>
           <w:rStyle w:val="CommentTok"/>
         </w:rPr>
-        <w:t xml:space="preserve">#&gt; 1  6.15 1     HlyE_IgA    4.25 </w:t>
+        <w:t xml:space="preserve">#&gt; 1  9.41 1     HlyE_IgA    0.281</w:t>
       </w:r>
       <w:r>
         <w:br/>
@@ -3076,7 +3076,7 @@
         <w:rPr>
           <w:rStyle w:val="CommentTok"/>
         </w:rPr>
-        <w:t xml:space="preserve">#&gt; 2  6.15 1     HlyE_IgG    4.65 </w:t>
+        <w:t xml:space="preserve">#&gt; 2  9.41 1     HlyE_IgG    0.560</w:t>
       </w:r>
       <w:r>
         <w:br/>
@@ -3085,7 +3085,7 @@
         <w:rPr>
           <w:rStyle w:val="CommentTok"/>
         </w:rPr>
-        <w:t xml:space="preserve">#&gt; 3 10.2  2     HlyE_IgA    0.557</w:t>
+        <w:t xml:space="preserve">#&gt; 3 15.8  2     HlyE_IgA    0.825</w:t>
       </w:r>
       <w:r>
         <w:br/>
@@ -3094,7 +3094,7 @@
         <w:rPr>
           <w:rStyle w:val="CommentTok"/>
         </w:rPr>
-        <w:t xml:space="preserve">#&gt; 4 10.2  2     HlyE_IgG    0.861</w:t>
+        <w:t xml:space="preserve">#&gt; 4 15.8  2     HlyE_IgG    0.705</w:t>
       </w:r>
       <w:r>
         <w:br/>
@@ -3103,7 +3103,7 @@
         <w:rPr>
           <w:rStyle w:val="CommentTok"/>
         </w:rPr>
-        <w:t xml:space="preserve">#&gt; 5 16.6  3     HlyE_IgA    2.33 </w:t>
+        <w:t xml:space="preserve">#&gt; 5 12.2  3     HlyE_IgA    0.479</w:t>
       </w:r>
       <w:r>
         <w:br/>
@@ -3112,7 +3112,7 @@
         <w:rPr>
           <w:rStyle w:val="CommentTok"/>
         </w:rPr>
-        <w:t xml:space="preserve">#&gt; 6 16.6  3     HlyE_IgG    5.07</w:t>
+        <w:t xml:space="preserve">#&gt; 6 12.2  3     HlyE_IgG    0.348</w:t>
       </w:r>
       <w:r>
         <w:br/>

</xml_diff>